<commit_message>
Add #68 — Secure File Transfer Tool (SFTP) JavaFX project
Full JavaFX SFTP client with transfer state machine, transient/terminal
exception hierarchy, pluggable integrity verification (CRC32/MD5/SHA-256),
sequential queue drain with per-file progress, and dark teal/charcoal UI.
Compiled cleanly against JavaFX SDK 26.0.1 (18 class files). Marks item #68
complete in the project checklist docx.

Co-Authored-By: Claude Sonnet 4.6 <noreply@anthropic.com>
</commit_message>
<xml_diff>
--- a/Automation for daily use/JAVA GUI/Now, Deep Research about 100 projects on Java GUI.docx
+++ b/Automation for daily use/JAVA GUI/Now, Deep Research about 100 projects on Java GUI.docx
@@ -1,6 +1,6 @@
 
 <file path=word/document.xml><?xml version="1.0" encoding="utf-8"?>
-<w:document xmlns:wpc="http://schemas.microsoft.com/office/word/2010/wordprocessingCanvas" xmlns:cx="http://schemas.microsoft.com/office/drawing/2014/chartex" xmlns:cx1="http://schemas.microsoft.com/office/drawing/2015/9/8/chartex" xmlns:cx2="http://schemas.microsoft.com/office/drawing/2015/10/21/chartex" xmlns:cx3="http://schemas.microsoft.com/office/drawing/2016/5/9/chartex" xmlns:cx4="http://schemas.microsoft.com/office/drawing/2016/5/10/chartex" xmlns:cx5="http://schemas.microsoft.com/office/drawing/2016/5/11/chartex" xmlns:cx6="http://schemas.microsoft.com/office/drawing/2016/5/12/chartex" xmlns:cx7="http://schemas.microsoft.com/office/drawing/2016/5/13/chartex" xmlns:cx8="http://schemas.microsoft.com/office/drawing/2016/5/14/chartex" xmlns:mc="http://schemas.openxmlformats.org/markup-compatibility/2006" xmlns:aink="http://schemas.microsoft.com/office/drawing/2016/ink" xmlns:am3d="http://schemas.microsoft.com/office/drawing/2017/model3d" xmlns:o="urn:schemas-microsoft-com:office:office" xmlns:oel="http://schemas.microsoft.com/office/2019/extlst" xmlns:r="http://schemas.openxmlformats.org/officeDocument/2006/relationships" xmlns:m="http://schemas.openxmlformats.org/officeDocument/2006/math" xmlns:v="urn:schemas-microsoft-com:vml" xmlns:wp14="http://schemas.microsoft.com/office/word/2010/wordprocessingDrawing" xmlns:wp="http://schemas.openxmlformats.org/drawingml/2006/wordprocessingDrawing" xmlns:w10="urn:schemas-microsoft-com:office:word" xmlns:w="http://schemas.openxmlformats.org/wordprocessingml/2006/main" xmlns:w14="http://schemas.microsoft.com/office/word/2010/wordml" xmlns:w15="http://schemas.microsoft.com/office/word/2012/wordml" xmlns:w16cex="http://schemas.microsoft.com/office/word/2018/wordml/cex" xmlns:w16cid="http://schemas.microsoft.com/office/word/2016/wordml/cid" xmlns:w16="http://schemas.microsoft.com/office/word/2018/wordml" xmlns:w16du="http://schemas.microsoft.com/office/word/2023/wordml/word16du" xmlns:w16sdtdh="http://schemas.microsoft.com/office/word/2020/wordml/sdtdatahash" xmlns:w16sdtfl="http://schemas.microsoft.com/office/word/2024/wordml/sdtformatlock" xmlns:w16se="http://schemas.microsoft.com/office/word/2015/wordml/symex" xmlns:wpg="http://schemas.microsoft.com/office/word/2010/wordprocessingGroup" xmlns:wpi="http://schemas.microsoft.com/office/word/2010/wordprocessingInk" xmlns:wne="http://schemas.microsoft.com/office/word/2006/wordml" xmlns:wps="http://schemas.microsoft.com/office/word/2010/wordprocessingShape" mc:Ignorable="w14 w15 w16se w16cid w16 w16cex w16sdtdh w16sdtfl w16du wp14">
+<w:document xmlns:a="http://schemas.openxmlformats.org/drawingml/2006/main" xmlns:mc="http://schemas.openxmlformats.org/markup-compatibility/2006" xmlns:o="urn:schemas-microsoft-com:office:office" xmlns:pic="http://schemas.openxmlformats.org/drawingml/2006/picture" xmlns:r="http://schemas.openxmlformats.org/officeDocument/2006/relationships" xmlns:v="urn:schemas-microsoft-com:vml" xmlns:w="http://schemas.openxmlformats.org/wordprocessingml/2006/main" xmlns:w10="urn:schemas-microsoft-com:office:word" xmlns:w14="http://schemas.microsoft.com/office/word/2010/wordml" xmlns:wp="http://schemas.openxmlformats.org/drawingml/2006/wordprocessingDrawing" xmlns:wp14="http://schemas.microsoft.com/office/word/2010/wordprocessingDrawing" xmlns:wpg="http://schemas.microsoft.com/office/word/2010/wordprocessingGroup" xmlns:wps="http://schemas.microsoft.com/office/word/2010/wordprocessingShape" mc:Ignorable="w14 w15 w16se w16cid w16 w16cex w16sdtdh w16sdtfl w16du wp14">
   <w:body>
     <w:p>
       <w:pPr>
@@ -16,9 +16,9 @@
             <wp:effectExtent l="0" t="0" r="0" b="0"/>
             <wp:docPr id="7" name="Picture 7"/>
             <wp:cNvGraphicFramePr/>
-            <a:graphic xmlns:a="http://schemas.openxmlformats.org/drawingml/2006/main">
+            <a:graphic>
               <a:graphicData uri="http://schemas.openxmlformats.org/drawingml/2006/picture">
-                <pic:pic xmlns:pic="http://schemas.openxmlformats.org/drawingml/2006/picture">
+                <pic:pic>
                   <pic:nvPicPr>
                     <pic:cNvPr id="7" name="Picture 7"/>
                     <pic:cNvPicPr/>
@@ -128,7 +128,7 @@
                 <wp:effectExtent l="0" t="0" r="0" b="0"/>
                 <wp:docPr id="10131" name="Group 10131"/>
                 <wp:cNvGraphicFramePr/>
-                <a:graphic xmlns:a="http://schemas.openxmlformats.org/drawingml/2006/main">
+                <a:graphic>
                   <a:graphicData uri="http://schemas.microsoft.com/office/word/2010/wordprocessingGroup">
                     <wpg:wgp>
                       <wpg:cNvGrpSpPr/>
@@ -890,7 +890,7 @@
                 <wp:effectExtent l="0" t="0" r="0" b="0"/>
                 <wp:docPr id="10120" name="Group 10120"/>
                 <wp:cNvGraphicFramePr/>
-                <a:graphic xmlns:a="http://schemas.openxmlformats.org/drawingml/2006/main">
+                <a:graphic>
                   <a:graphicData uri="http://schemas.microsoft.com/office/word/2010/wordprocessingGroup">
                     <wpg:wgp>
                       <wpg:cNvGrpSpPr/>
@@ -1642,7 +1642,7 @@
                 <wp:effectExtent l="0" t="0" r="0" b="0"/>
                 <wp:docPr id="10334" name="Group 10334"/>
                 <wp:cNvGraphicFramePr/>
-                <a:graphic xmlns:a="http://schemas.openxmlformats.org/drawingml/2006/main">
+                <a:graphic>
                   <a:graphicData uri="http://schemas.microsoft.com/office/word/2010/wordprocessingGroup">
                     <wpg:wgp>
                       <wpg:cNvGrpSpPr/>
@@ -1833,6 +1833,7 @@
       <w:r>
         <w:rPr>
           <w:b/>
+          <w:color w:val="EE0000"/>
           <w:sz w:val="21"/>
         </w:rPr>
         <w:t>Secure File Transfer Tool Java SFTP</w:t>
@@ -2392,7 +2393,7 @@
                 <wp:wrapSquare wrapText="bothSides"/>
                 <wp:docPr id="10417" name="Group 10417"/>
                 <wp:cNvGraphicFramePr/>
-                <a:graphic xmlns:a="http://schemas.openxmlformats.org/drawingml/2006/main">
+                <a:graphic>
                   <a:graphicData uri="http://schemas.microsoft.com/office/word/2010/wordprocessingGroup">
                     <wpg:wgp>
                       <wpg:cNvGrpSpPr/>
@@ -3046,7 +3047,7 @@
                 <wp:effectExtent l="0" t="0" r="0" b="0"/>
                 <wp:docPr id="11325" name="Group 11325"/>
                 <wp:cNvGraphicFramePr/>
-                <a:graphic xmlns:a="http://schemas.openxmlformats.org/drawingml/2006/main">
+                <a:graphic>
                   <a:graphicData uri="http://schemas.microsoft.com/office/word/2010/wordprocessingGroup">
                     <wpg:wgp>
                       <wpg:cNvGrpSpPr/>
@@ -3251,7 +3252,7 @@
                 <wp:effectExtent l="0" t="0" r="0" b="0"/>
                 <wp:docPr id="11326" name="Group 11326"/>
                 <wp:cNvGraphicFramePr/>
-                <a:graphic xmlns:a="http://schemas.openxmlformats.org/drawingml/2006/main">
+                <a:graphic>
                   <a:graphicData uri="http://schemas.microsoft.com/office/word/2010/wordprocessingGroup">
                     <wpg:wgp>
                       <wpg:cNvGrpSpPr/>
@@ -3429,7 +3430,7 @@
                 <wp:effectExtent l="0" t="0" r="0" b="0"/>
                 <wp:docPr id="11327" name="Group 11327"/>
                 <wp:cNvGraphicFramePr/>
-                <a:graphic xmlns:a="http://schemas.openxmlformats.org/drawingml/2006/main">
+                <a:graphic>
                   <a:graphicData uri="http://schemas.microsoft.com/office/word/2010/wordprocessingGroup">
                     <wpg:wgp>
                       <wpg:cNvGrpSpPr/>
@@ -3632,7 +3633,7 @@
                 <wp:wrapSquare wrapText="bothSides"/>
                 <wp:docPr id="11328" name="Group 11328"/>
                 <wp:cNvGraphicFramePr/>
-                <a:graphic xmlns:a="http://schemas.openxmlformats.org/drawingml/2006/main">
+                <a:graphic>
                   <a:graphicData uri="http://schemas.microsoft.com/office/word/2010/wordprocessingGroup">
                     <wpg:wgp>
                       <wpg:cNvGrpSpPr/>

</xml_diff>